<commit_message>
Update Putt for Fough module
</commit_message>
<xml_diff>
--- a/golf/pga_drive_putt/PGACorrelationsNoTech-Ans.docx
+++ b/golf/pga_drive_putt/PGACorrelationsNoTech-Ans.docx
@@ -1,6 +1,6 @@
 
 <file path=word/document.xml><?xml version="1.0" encoding="utf-8"?>
-<w:document xmlns:wpc="http://schemas.microsoft.com/office/word/2010/wordprocessingCanvas" xmlns:cx="http://schemas.microsoft.com/office/drawing/2014/chartex" xmlns:cx1="http://schemas.microsoft.com/office/drawing/2015/9/8/chartex" xmlns:cx2="http://schemas.microsoft.com/office/drawing/2015/10/21/chartex" xmlns:cx3="http://schemas.microsoft.com/office/drawing/2016/5/9/chartex" xmlns:cx4="http://schemas.microsoft.com/office/drawing/2016/5/10/chartex" xmlns:cx5="http://schemas.microsoft.com/office/drawing/2016/5/11/chartex" xmlns:cx6="http://schemas.microsoft.com/office/drawing/2016/5/12/chartex" xmlns:cx7="http://schemas.microsoft.com/office/drawing/2016/5/13/chartex" xmlns:cx8="http://schemas.microsoft.com/office/drawing/2016/5/14/chartex" xmlns:mc="http://schemas.openxmlformats.org/markup-compatibility/2006" xmlns:aink="http://schemas.microsoft.com/office/drawing/2016/ink" xmlns:am3d="http://schemas.microsoft.com/office/drawing/2017/model3d" xmlns:o="urn:schemas-microsoft-com:office:office" xmlns:oel="http://schemas.microsoft.com/office/2019/extlst" xmlns:r="http://schemas.openxmlformats.org/officeDocument/2006/relationships" xmlns:m="http://schemas.openxmlformats.org/officeDocument/2006/math" xmlns:v="urn:schemas-microsoft-com:vml" xmlns:wp14="http://schemas.microsoft.com/office/word/2010/wordprocessingDrawing" xmlns:wp="http://schemas.openxmlformats.org/drawingml/2006/wordprocessingDrawing" xmlns:w10="urn:schemas-microsoft-com:office:word" xmlns:w="http://schemas.openxmlformats.org/wordprocessingml/2006/main" xmlns:w14="http://schemas.microsoft.com/office/word/2010/wordml" xmlns:w15="http://schemas.microsoft.com/office/word/2012/wordml" xmlns:w16cex="http://schemas.microsoft.com/office/word/2018/wordml/cex" xmlns:w16cid="http://schemas.microsoft.com/office/word/2016/wordml/cid" xmlns:w16="http://schemas.microsoft.com/office/word/2018/wordml" xmlns:w16du="http://schemas.microsoft.com/office/word/2023/wordml/word16du" xmlns:w16sdtdh="http://schemas.microsoft.com/office/word/2020/wordml/sdtdatahash" xmlns:w16se="http://schemas.microsoft.com/office/word/2015/wordml/symex" xmlns:wpg="http://schemas.microsoft.com/office/word/2010/wordprocessingGroup" xmlns:wpi="http://schemas.microsoft.com/office/word/2010/wordprocessingInk" xmlns:wne="http://schemas.microsoft.com/office/word/2006/wordml" xmlns:wps="http://schemas.microsoft.com/office/word/2010/wordprocessingShape" mc:Ignorable="w14 w15 w16se w16cid w16 w16cex w16sdtdh wp14">
+<w:document xmlns:wpc="http://schemas.microsoft.com/office/word/2010/wordprocessingCanvas" xmlns:cx="http://schemas.microsoft.com/office/drawing/2014/chartex" xmlns:cx1="http://schemas.microsoft.com/office/drawing/2015/9/8/chartex" xmlns:cx2="http://schemas.microsoft.com/office/drawing/2015/10/21/chartex" xmlns:cx3="http://schemas.microsoft.com/office/drawing/2016/5/9/chartex" xmlns:cx4="http://schemas.microsoft.com/office/drawing/2016/5/10/chartex" xmlns:cx5="http://schemas.microsoft.com/office/drawing/2016/5/11/chartex" xmlns:cx6="http://schemas.microsoft.com/office/drawing/2016/5/12/chartex" xmlns:cx7="http://schemas.microsoft.com/office/drawing/2016/5/13/chartex" xmlns:cx8="http://schemas.microsoft.com/office/drawing/2016/5/14/chartex" xmlns:mc="http://schemas.openxmlformats.org/markup-compatibility/2006" xmlns:aink="http://schemas.microsoft.com/office/drawing/2016/ink" xmlns:am3d="http://schemas.microsoft.com/office/drawing/2017/model3d" xmlns:o="urn:schemas-microsoft-com:office:office" xmlns:oel="http://schemas.microsoft.com/office/2019/extlst" xmlns:r="http://schemas.openxmlformats.org/officeDocument/2006/relationships" xmlns:m="http://schemas.openxmlformats.org/officeDocument/2006/math" xmlns:v="urn:schemas-microsoft-com:vml" xmlns:wp14="http://schemas.microsoft.com/office/word/2010/wordprocessingDrawing" xmlns:wp="http://schemas.openxmlformats.org/drawingml/2006/wordprocessingDrawing" xmlns:w10="urn:schemas-microsoft-com:office:word" xmlns:w="http://schemas.openxmlformats.org/wordprocessingml/2006/main" xmlns:w14="http://schemas.microsoft.com/office/word/2010/wordml" xmlns:w15="http://schemas.microsoft.com/office/word/2012/wordml" xmlns:w16cex="http://schemas.microsoft.com/office/word/2018/wordml/cex" xmlns:w16cid="http://schemas.microsoft.com/office/word/2016/wordml/cid" xmlns:w16="http://schemas.microsoft.com/office/word/2018/wordml" xmlns:w16du="http://schemas.microsoft.com/office/word/2023/wordml/word16du" xmlns:w16sdtdh="http://schemas.microsoft.com/office/word/2020/wordml/sdtdatahash" xmlns:w16sdtfl="http://schemas.microsoft.com/office/word/2024/wordml/sdtformatlock" xmlns:w16se="http://schemas.microsoft.com/office/word/2015/wordml/symex" xmlns:wpg="http://schemas.microsoft.com/office/word/2010/wordprocessingGroup" xmlns:wpi="http://schemas.microsoft.com/office/word/2010/wordprocessingInk" xmlns:wne="http://schemas.microsoft.com/office/word/2006/wordml" xmlns:wps="http://schemas.microsoft.com/office/word/2010/wordprocessingShape" mc:Ignorable="w14 w15 w16se w16cid w16 w16cex w16sdtdh w16sdtfl w16du wp14">
   <w:body>
     <w:p>
       <w:pPr>
@@ -25,16 +25,64 @@
         <w:ind w:firstLine="720"/>
       </w:pPr>
       <w:r>
-        <w:t xml:space="preserve">Golf is a sport where you hit a ball into a series of holes with as few strokes as possible. The two most important strokes are the drive and the putt. The drive is </w:t>
+        <w:t xml:space="preserve">Golf is a sport where you hit a ball into </w:t>
+      </w:r>
+      <w:r>
+        <w:t>a</w:t>
+      </w:r>
+      <w:r>
+        <w:t xml:space="preserve"> hole with as few strokes as possible. </w:t>
+      </w:r>
+      <w:r>
+        <w:t xml:space="preserve">Two </w:t>
+      </w:r>
+      <w:r>
+        <w:t>important strokes are drive</w:t>
+      </w:r>
+      <w:r>
+        <w:t>s</w:t>
+      </w:r>
+      <w:r>
+        <w:t xml:space="preserve"> and putt</w:t>
+      </w:r>
+      <w:r>
+        <w:t>s</w:t>
+      </w:r>
+      <w:r>
+        <w:t xml:space="preserve">. </w:t>
+      </w:r>
+      <w:r>
+        <w:t>A</w:t>
+      </w:r>
+      <w:r>
+        <w:t xml:space="preserve"> drive is </w:t>
       </w:r>
       <w:r>
         <w:t xml:space="preserve">the first stroke used to hit the ball as far </w:t>
       </w:r>
       <w:r>
-        <w:t xml:space="preserve">as possible from the tee box towards the hole, while the putt is the </w:t>
-      </w:r>
-      <w:r>
-        <w:t>final stroke used to roll the ball into the hole on the green.</w:t>
+        <w:t xml:space="preserve">as possible from the tee box towards the hole, while </w:t>
+      </w:r>
+      <w:r>
+        <w:t>a</w:t>
+      </w:r>
+      <w:r>
+        <w:t xml:space="preserve"> putt </w:t>
+      </w:r>
+      <w:r>
+        <w:t xml:space="preserve">is </w:t>
+      </w:r>
+      <w:r>
+        <w:t xml:space="preserve">an attempt to </w:t>
+      </w:r>
+      <w:r>
+        <w:t xml:space="preserve"> roll the ball into the hole </w:t>
+      </w:r>
+      <w:r>
+        <w:t xml:space="preserve">from on </w:t>
+      </w:r>
+      <w:r>
+        <w:t>the green.</w:t>
       </w:r>
     </w:p>
     <w:p>
@@ -42,7 +90,19 @@
         <w:ind w:firstLine="720"/>
       </w:pPr>
       <w:r>
-        <w:t xml:space="preserve">The PGA2022 data set has statistics with variables for driving (Average Driving Distance, Driving Accuracy Percentage, and Strokes Gained Off the Tee), putting (Average Putts Per Round, One Putt Percentage, and Strokes Gained Putts), and measured success (Scoring Average, Money, and </w:t>
+        <w:t>The PGA2022 data set has statistics with variables for driving (Average Driving Distance, Driving Accuracy Percentage, and Strokes Gained Off the Tee), putting (Average Putts Per Round, One Putt Percentage, and Strokes Gained Putt</w:t>
+      </w:r>
+      <w:r>
+        <w:t>ing</w:t>
+      </w:r>
+      <w:r>
+        <w:t>), and measured success (Scoring Average, Money</w:t>
+      </w:r>
+      <w:r>
+        <w:t xml:space="preserve"> won </w:t>
+      </w:r>
+      <w:r>
+        <w:t xml:space="preserve">, and </w:t>
       </w:r>
       <w:proofErr w:type="spellStart"/>
       <w:r>
@@ -50,7 +110,48 @@
       </w:r>
       <w:proofErr w:type="spellEnd"/>
       <w:r>
-        <w:t xml:space="preserve"> Points) with other variables such as Player Name, Country, and Tournament.</w:t>
+        <w:t xml:space="preserve"> Points).</w:t>
+      </w:r>
+      <w:r>
+        <w:t xml:space="preserve"> </w:t>
+      </w:r>
+      <w:r>
+        <w:t xml:space="preserve">Note that each </w:t>
+      </w:r>
+      <w:proofErr w:type="gramStart"/>
+      <w:r>
+        <w:t>putt taken</w:t>
+      </w:r>
+      <w:proofErr w:type="gramEnd"/>
+      <w:r>
+        <w:t xml:space="preserve"> contributes to each of the Average Putts Per Round, Stokes Gained </w:t>
+      </w:r>
+      <w:proofErr w:type="gramStart"/>
+      <w:r>
+        <w:t>Putting, and</w:t>
+      </w:r>
+      <w:proofErr w:type="gramEnd"/>
+      <w:r>
+        <w:t xml:space="preserve"> Scoring Average variables. </w:t>
+      </w:r>
+      <w:r>
+        <w:t xml:space="preserve">There are 1376 rows in the dataset, with each row summarizing the results for a single golfer in one tournament. </w:t>
+      </w:r>
+    </w:p>
+    <w:p>
+      <w:pPr>
+        <w:ind w:firstLine="720"/>
+      </w:pPr>
+      <w:r>
+        <w:t xml:space="preserve">Here is a matrix showing the </w:t>
+      </w:r>
+      <w:proofErr w:type="gramStart"/>
+      <w:r>
+        <w:t>correlations</w:t>
+      </w:r>
+      <w:proofErr w:type="gramEnd"/>
+      <w:r>
+        <w:t xml:space="preserve"> between all pairs of quantitative variables in this dataset.  Note that for this size sample a correlation as small as 0.055 still provides evidence of a discernible association between the two variables. </w:t>
       </w:r>
     </w:p>
     <w:tbl>
@@ -353,7 +454,35 @@
                 <w:sz w:val="18"/>
                 <w:szCs w:val="18"/>
               </w:rPr>
-              <w:t>-0.25</w:t>
+              <w:t>-0.2</w:t>
+            </w:r>
+            <w:r>
+              <w:rPr>
+                <w:sz w:val="18"/>
+                <w:szCs w:val="18"/>
+              </w:rPr>
+              <w:t>62</w:t>
+            </w:r>
+          </w:p>
+        </w:tc>
+        <w:tc>
+          <w:tcPr>
+            <w:tcW w:w="1550" w:type="dxa"/>
+          </w:tcPr>
+          <w:p>
+            <w:pPr>
+              <w:jc w:val="center"/>
+              <w:rPr>
+                <w:sz w:val="18"/>
+                <w:szCs w:val="18"/>
+              </w:rPr>
+            </w:pPr>
+            <w:r>
+              <w:rPr>
+                <w:sz w:val="18"/>
+                <w:szCs w:val="18"/>
+              </w:rPr>
+              <w:t>0.2</w:t>
             </w:r>
             <w:r>
               <w:rPr>
@@ -362,33 +491,12 @@
               </w:rPr>
               <w:t>9</w:t>
             </w:r>
-          </w:p>
-        </w:tc>
-        <w:tc>
-          <w:tcPr>
-            <w:tcW w:w="1550" w:type="dxa"/>
-          </w:tcPr>
-          <w:p>
-            <w:pPr>
-              <w:jc w:val="center"/>
-              <w:rPr>
-                <w:sz w:val="18"/>
-                <w:szCs w:val="18"/>
-              </w:rPr>
-            </w:pPr>
-            <w:r>
-              <w:rPr>
-                <w:sz w:val="18"/>
-                <w:szCs w:val="18"/>
-              </w:rPr>
-              <w:t>0.2</w:t>
-            </w:r>
-            <w:r>
-              <w:rPr>
-                <w:sz w:val="18"/>
-                <w:szCs w:val="18"/>
-              </w:rPr>
-              <w:t>90</w:t>
+            <w:r>
+              <w:rPr>
+                <w:sz w:val="18"/>
+                <w:szCs w:val="18"/>
+              </w:rPr>
+              <w:t>4</w:t>
             </w:r>
           </w:p>
         </w:tc>
@@ -409,7 +517,14 @@
                 <w:sz w:val="18"/>
                 <w:szCs w:val="18"/>
               </w:rPr>
-              <w:t>0.113</w:t>
+              <w:t>0.11</w:t>
+            </w:r>
+            <w:r>
+              <w:rPr>
+                <w:sz w:val="18"/>
+                <w:szCs w:val="18"/>
+              </w:rPr>
+              <w:t>8</w:t>
             </w:r>
           </w:p>
         </w:tc>
@@ -437,7 +552,14 @@
                 <w:sz w:val="18"/>
                 <w:szCs w:val="18"/>
               </w:rPr>
-              <w:t>85</w:t>
+              <w:t>8</w:t>
+            </w:r>
+            <w:r>
+              <w:rPr>
+                <w:sz w:val="18"/>
+                <w:szCs w:val="18"/>
+              </w:rPr>
+              <w:t>9</w:t>
             </w:r>
           </w:p>
         </w:tc>
@@ -479,7 +601,14 @@
                 <w:sz w:val="18"/>
                 <w:szCs w:val="18"/>
               </w:rPr>
-              <w:t>-0.179</w:t>
+              <w:t>-0.1</w:t>
+            </w:r>
+            <w:r>
+              <w:rPr>
+                <w:sz w:val="18"/>
+                <w:szCs w:val="18"/>
+              </w:rPr>
+              <w:t>84</w:t>
             </w:r>
           </w:p>
         </w:tc>
@@ -574,7 +703,14 @@
                 <w:sz w:val="18"/>
                 <w:szCs w:val="18"/>
               </w:rPr>
-              <w:t>-0.259</w:t>
+              <w:t>-0.2</w:t>
+            </w:r>
+            <w:r>
+              <w:rPr>
+                <w:sz w:val="18"/>
+                <w:szCs w:val="18"/>
+              </w:rPr>
+              <w:t>62</w:t>
             </w:r>
           </w:p>
         </w:tc>
@@ -616,14 +752,14 @@
                 <w:sz w:val="18"/>
                 <w:szCs w:val="18"/>
               </w:rPr>
-              <w:t>0.4</w:t>
-            </w:r>
-            <w:r>
-              <w:rPr>
-                <w:sz w:val="18"/>
-                <w:szCs w:val="18"/>
-              </w:rPr>
-              <w:t>07</w:t>
+              <w:t>0.</w:t>
+            </w:r>
+            <w:r>
+              <w:rPr>
+                <w:sz w:val="18"/>
+                <w:szCs w:val="18"/>
+              </w:rPr>
+              <w:t>393</w:t>
             </w:r>
           </w:p>
         </w:tc>
@@ -644,7 +780,14 @@
                 <w:sz w:val="18"/>
                 <w:szCs w:val="18"/>
               </w:rPr>
-              <w:t>0.117</w:t>
+              <w:t>0.11</w:t>
+            </w:r>
+            <w:r>
+              <w:rPr>
+                <w:sz w:val="18"/>
+                <w:szCs w:val="18"/>
+              </w:rPr>
+              <w:t>1</w:t>
             </w:r>
           </w:p>
         </w:tc>
@@ -686,7 +829,14 @@
                 <w:sz w:val="18"/>
                 <w:szCs w:val="18"/>
               </w:rPr>
-              <w:t>-0.033</w:t>
+              <w:t>-0.03</w:t>
+            </w:r>
+            <w:r>
+              <w:rPr>
+                <w:sz w:val="18"/>
+                <w:szCs w:val="18"/>
+              </w:rPr>
+              <w:t>6</w:t>
             </w:r>
           </w:p>
         </w:tc>
@@ -707,7 +857,14 @@
                 <w:sz w:val="18"/>
                 <w:szCs w:val="18"/>
               </w:rPr>
-              <w:t>-0.223</w:t>
+              <w:t>-0.2</w:t>
+            </w:r>
+            <w:r>
+              <w:rPr>
+                <w:sz w:val="18"/>
+                <w:szCs w:val="18"/>
+              </w:rPr>
+              <w:t>14</w:t>
             </w:r>
           </w:p>
         </w:tc>
@@ -802,7 +959,14 @@
                 <w:sz w:val="18"/>
                 <w:szCs w:val="18"/>
               </w:rPr>
-              <w:t>90</w:t>
+              <w:t>9</w:t>
+            </w:r>
+            <w:r>
+              <w:rPr>
+                <w:sz w:val="18"/>
+                <w:szCs w:val="18"/>
+              </w:rPr>
+              <w:t>4</w:t>
             </w:r>
           </w:p>
         </w:tc>
@@ -823,7 +987,14 @@
                 <w:sz w:val="18"/>
                 <w:szCs w:val="18"/>
               </w:rPr>
-              <w:t>0.407</w:t>
+              <w:t>0.</w:t>
+            </w:r>
+            <w:r>
+              <w:rPr>
+                <w:sz w:val="18"/>
+                <w:szCs w:val="18"/>
+              </w:rPr>
+              <w:t>393</w:t>
             </w:r>
           </w:p>
         </w:tc>
@@ -865,7 +1036,14 @@
                 <w:sz w:val="18"/>
                 <w:szCs w:val="18"/>
               </w:rPr>
-              <w:t>0.192</w:t>
+              <w:t>0.1</w:t>
+            </w:r>
+            <w:r>
+              <w:rPr>
+                <w:sz w:val="18"/>
+                <w:szCs w:val="18"/>
+              </w:rPr>
+              <w:t>85</w:t>
             </w:r>
           </w:p>
         </w:tc>
@@ -886,7 +1064,14 @@
                 <w:sz w:val="18"/>
                 <w:szCs w:val="18"/>
               </w:rPr>
-              <w:t>-0.172</w:t>
+              <w:t>-0.1</w:t>
+            </w:r>
+            <w:r>
+              <w:rPr>
+                <w:sz w:val="18"/>
+                <w:szCs w:val="18"/>
+              </w:rPr>
+              <w:t>68</w:t>
             </w:r>
           </w:p>
         </w:tc>
@@ -907,7 +1092,14 @@
                 <w:sz w:val="18"/>
                 <w:szCs w:val="18"/>
               </w:rPr>
-              <w:t>-0.140</w:t>
+              <w:t>-0.1</w:t>
+            </w:r>
+            <w:r>
+              <w:rPr>
+                <w:sz w:val="18"/>
+                <w:szCs w:val="18"/>
+              </w:rPr>
+              <w:t>38</w:t>
             </w:r>
           </w:p>
         </w:tc>
@@ -928,7 +1120,14 @@
                 <w:sz w:val="18"/>
                 <w:szCs w:val="18"/>
               </w:rPr>
-              <w:t>-0.334</w:t>
+              <w:t>-0.33</w:t>
+            </w:r>
+            <w:r>
+              <w:rPr>
+                <w:sz w:val="18"/>
+                <w:szCs w:val="18"/>
+              </w:rPr>
+              <w:t>1</w:t>
             </w:r>
           </w:p>
         </w:tc>
@@ -1016,7 +1215,14 @@
                 <w:sz w:val="18"/>
                 <w:szCs w:val="18"/>
               </w:rPr>
-              <w:t>0.113</w:t>
+              <w:t>0.11</w:t>
+            </w:r>
+            <w:r>
+              <w:rPr>
+                <w:sz w:val="18"/>
+                <w:szCs w:val="18"/>
+              </w:rPr>
+              <w:t>8</w:t>
             </w:r>
           </w:p>
         </w:tc>
@@ -1037,7 +1243,14 @@
                 <w:sz w:val="18"/>
                 <w:szCs w:val="18"/>
               </w:rPr>
-              <w:t>0.117</w:t>
+              <w:t>0.11</w:t>
+            </w:r>
+            <w:r>
+              <w:rPr>
+                <w:sz w:val="18"/>
+                <w:szCs w:val="18"/>
+              </w:rPr>
+              <w:t>1</w:t>
             </w:r>
           </w:p>
         </w:tc>
@@ -1058,14 +1271,14 @@
                 <w:sz w:val="18"/>
                 <w:szCs w:val="18"/>
               </w:rPr>
-              <w:t>0.19</w:t>
-            </w:r>
-            <w:r>
-              <w:rPr>
-                <w:sz w:val="18"/>
-                <w:szCs w:val="18"/>
-              </w:rPr>
-              <w:t>2</w:t>
+              <w:t>0.1</w:t>
+            </w:r>
+            <w:r>
+              <w:rPr>
+                <w:sz w:val="18"/>
+                <w:szCs w:val="18"/>
+              </w:rPr>
+              <w:t>85</w:t>
             </w:r>
           </w:p>
         </w:tc>
@@ -1107,14 +1320,14 @@
                 <w:sz w:val="18"/>
                 <w:szCs w:val="18"/>
               </w:rPr>
-              <w:t>-0.90</w:t>
-            </w:r>
-            <w:r>
-              <w:rPr>
-                <w:sz w:val="18"/>
-                <w:szCs w:val="18"/>
-              </w:rPr>
-              <w:t>0</w:t>
+              <w:t>-0.</w:t>
+            </w:r>
+            <w:r>
+              <w:rPr>
+                <w:sz w:val="18"/>
+                <w:szCs w:val="18"/>
+              </w:rPr>
+              <w:t>896</w:t>
             </w:r>
           </w:p>
         </w:tc>
@@ -1135,7 +1348,14 @@
                 <w:sz w:val="18"/>
                 <w:szCs w:val="18"/>
               </w:rPr>
-              <w:t>-0.512</w:t>
+              <w:t>-0.51</w:t>
+            </w:r>
+            <w:r>
+              <w:rPr>
+                <w:sz w:val="18"/>
+                <w:szCs w:val="18"/>
+              </w:rPr>
+              <w:t>6</w:t>
             </w:r>
           </w:p>
         </w:tc>
@@ -1156,7 +1376,14 @@
                 <w:sz w:val="18"/>
                 <w:szCs w:val="18"/>
               </w:rPr>
-              <w:t>0.027</w:t>
+              <w:t>0.0</w:t>
+            </w:r>
+            <w:r>
+              <w:rPr>
+                <w:sz w:val="18"/>
+                <w:szCs w:val="18"/>
+              </w:rPr>
+              <w:t>30</w:t>
             </w:r>
           </w:p>
         </w:tc>
@@ -1244,7 +1471,14 @@
                 <w:sz w:val="18"/>
                 <w:szCs w:val="18"/>
               </w:rPr>
-              <w:t>-0.085</w:t>
+              <w:t>-0.08</w:t>
+            </w:r>
+            <w:r>
+              <w:rPr>
+                <w:sz w:val="18"/>
+                <w:szCs w:val="18"/>
+              </w:rPr>
+              <w:t>9</w:t>
             </w:r>
           </w:p>
         </w:tc>
@@ -1265,7 +1499,14 @@
                 <w:sz w:val="18"/>
                 <w:szCs w:val="18"/>
               </w:rPr>
-              <w:t>-0.117</w:t>
+              <w:t>-0.11</w:t>
+            </w:r>
+            <w:r>
+              <w:rPr>
+                <w:sz w:val="18"/>
+                <w:szCs w:val="18"/>
+              </w:rPr>
+              <w:t>6</w:t>
             </w:r>
           </w:p>
         </w:tc>
@@ -1286,7 +1527,14 @@
                 <w:sz w:val="18"/>
                 <w:szCs w:val="18"/>
               </w:rPr>
-              <w:t>-0.172</w:t>
+              <w:t>-0.1</w:t>
+            </w:r>
+            <w:r>
+              <w:rPr>
+                <w:sz w:val="18"/>
+                <w:szCs w:val="18"/>
+              </w:rPr>
+              <w:t>68</w:t>
             </w:r>
           </w:p>
         </w:tc>
@@ -1307,7 +1555,14 @@
                 <w:sz w:val="18"/>
                 <w:szCs w:val="18"/>
               </w:rPr>
-              <w:t>-0.900</w:t>
+              <w:t>-0.</w:t>
+            </w:r>
+            <w:r>
+              <w:rPr>
+                <w:sz w:val="18"/>
+                <w:szCs w:val="18"/>
+              </w:rPr>
+              <w:t>896</w:t>
             </w:r>
           </w:p>
         </w:tc>
@@ -1370,7 +1625,14 @@
                 <w:sz w:val="18"/>
                 <w:szCs w:val="18"/>
               </w:rPr>
-              <w:t>-0.007</w:t>
+              <w:t>-0.00</w:t>
+            </w:r>
+            <w:r>
+              <w:rPr>
+                <w:sz w:val="18"/>
+                <w:szCs w:val="18"/>
+              </w:rPr>
+              <w:t>5</w:t>
             </w:r>
           </w:p>
         </w:tc>
@@ -1479,7 +1741,14 @@
                 <w:sz w:val="18"/>
                 <w:szCs w:val="18"/>
               </w:rPr>
-              <w:t>-0.033</w:t>
+              <w:t>-0.03</w:t>
+            </w:r>
+            <w:r>
+              <w:rPr>
+                <w:sz w:val="18"/>
+                <w:szCs w:val="18"/>
+              </w:rPr>
+              <w:t>6</w:t>
             </w:r>
           </w:p>
         </w:tc>
@@ -1500,7 +1769,14 @@
                 <w:sz w:val="18"/>
                 <w:szCs w:val="18"/>
               </w:rPr>
-              <w:t>-0.139</w:t>
+              <w:t>-0.13</w:t>
+            </w:r>
+            <w:r>
+              <w:rPr>
+                <w:sz w:val="18"/>
+                <w:szCs w:val="18"/>
+              </w:rPr>
+              <w:t>8</w:t>
             </w:r>
           </w:p>
         </w:tc>
@@ -1521,7 +1797,14 @@
                 <w:sz w:val="18"/>
                 <w:szCs w:val="18"/>
               </w:rPr>
-              <w:t>-0.512</w:t>
+              <w:t>-0.51</w:t>
+            </w:r>
+            <w:r>
+              <w:rPr>
+                <w:sz w:val="18"/>
+                <w:szCs w:val="18"/>
+              </w:rPr>
+              <w:t>6</w:t>
             </w:r>
           </w:p>
         </w:tc>
@@ -1584,7 +1867,14 @@
                 <w:sz w:val="18"/>
                 <w:szCs w:val="18"/>
               </w:rPr>
-              <w:t>-0.358</w:t>
+              <w:t>-0.35</w:t>
+            </w:r>
+            <w:r>
+              <w:rPr>
+                <w:sz w:val="18"/>
+                <w:szCs w:val="18"/>
+              </w:rPr>
+              <w:t>7</w:t>
             </w:r>
           </w:p>
         </w:tc>
@@ -1672,7 +1962,14 @@
                 <w:sz w:val="18"/>
                 <w:szCs w:val="18"/>
               </w:rPr>
-              <w:t>-0.179</w:t>
+              <w:t>-0.1</w:t>
+            </w:r>
+            <w:r>
+              <w:rPr>
+                <w:sz w:val="18"/>
+                <w:szCs w:val="18"/>
+              </w:rPr>
+              <w:t>84</w:t>
             </w:r>
           </w:p>
         </w:tc>
@@ -1693,7 +1990,14 @@
                 <w:sz w:val="18"/>
                 <w:szCs w:val="18"/>
               </w:rPr>
-              <w:t>-0.223</w:t>
+              <w:t>-0.2</w:t>
+            </w:r>
+            <w:r>
+              <w:rPr>
+                <w:sz w:val="18"/>
+                <w:szCs w:val="18"/>
+              </w:rPr>
+              <w:t>14</w:t>
             </w:r>
           </w:p>
         </w:tc>
@@ -1721,7 +2025,14 @@
                 <w:sz w:val="18"/>
                 <w:szCs w:val="18"/>
               </w:rPr>
-              <w:t>334</w:t>
+              <w:t>33</w:t>
+            </w:r>
+            <w:r>
+              <w:rPr>
+                <w:sz w:val="18"/>
+                <w:szCs w:val="18"/>
+              </w:rPr>
+              <w:t>1</w:t>
             </w:r>
           </w:p>
         </w:tc>
@@ -1742,7 +2053,14 @@
                 <w:sz w:val="18"/>
                 <w:szCs w:val="18"/>
               </w:rPr>
-              <w:t>0.027</w:t>
+              <w:t>0.0</w:t>
+            </w:r>
+            <w:r>
+              <w:rPr>
+                <w:sz w:val="18"/>
+                <w:szCs w:val="18"/>
+              </w:rPr>
+              <w:t>30</w:t>
             </w:r>
           </w:p>
         </w:tc>
@@ -1763,7 +2081,14 @@
                 <w:sz w:val="18"/>
                 <w:szCs w:val="18"/>
               </w:rPr>
-              <w:t>-0.007</w:t>
+              <w:t>-0.00</w:t>
+            </w:r>
+            <w:r>
+              <w:rPr>
+                <w:sz w:val="18"/>
+                <w:szCs w:val="18"/>
+              </w:rPr>
+              <w:t>5</w:t>
             </w:r>
           </w:p>
         </w:tc>
@@ -1784,7 +2109,14 @@
                 <w:sz w:val="18"/>
                 <w:szCs w:val="18"/>
               </w:rPr>
-              <w:t>-0.358</w:t>
+              <w:t>-0.35</w:t>
+            </w:r>
+            <w:r>
+              <w:rPr>
+                <w:sz w:val="18"/>
+                <w:szCs w:val="18"/>
+              </w:rPr>
+              <w:t>7</w:t>
             </w:r>
           </w:p>
         </w:tc>
@@ -2328,7 +2660,13 @@
         <w:t>predictor of</w:t>
       </w:r>
       <w:r>
-        <w:t xml:space="preserve"> money, average driving distance or average putts per round?</w:t>
+        <w:t xml:space="preserve"> money</w:t>
+      </w:r>
+      <w:r>
+        <w:t xml:space="preserve"> won in a tournament</w:t>
+      </w:r>
+      <w:r>
+        <w:t>, average driving distance or average putts per round?</w:t>
       </w:r>
       <w:r>
         <w:t xml:space="preserve"> Report the correlation.</w:t>
@@ -2417,6 +2755,12 @@
         <w:t>strokes gained</w:t>
       </w:r>
       <w:r>
+        <w:rPr>
+          <w:rStyle w:val="FootnoteReference"/>
+        </w:rPr>
+        <w:footnoteReference w:id="1"/>
+      </w:r>
+      <w:r>
         <w:t>?</w:t>
       </w:r>
       <w:r>
@@ -2429,6 +2773,7 @@
           <w:color w:val="FF0000"/>
         </w:rPr>
       </w:pPr>
+      <w:bookmarkStart w:id="0" w:name="_Hlk211955706"/>
       <w:r>
         <w:rPr>
           <w:color w:val="FF0000"/>
@@ -2469,7 +2814,13 @@
         <w:rPr>
           <w:color w:val="FF0000"/>
         </w:rPr>
-        <w:t xml:space="preserve"> -0.358</w:t>
+        <w:t xml:space="preserve"> -0.35</w:t>
+      </w:r>
+      <w:r>
+        <w:rPr>
+          <w:color w:val="FF0000"/>
+        </w:rPr>
+        <w:t>7</w:t>
       </w:r>
       <w:r>
         <w:rPr>
@@ -2478,6 +2829,7 @@
         <w:t xml:space="preserve"> </w:t>
       </w:r>
     </w:p>
+    <w:bookmarkEnd w:id="0"/>
     <w:p/>
     <w:p>
       <w:pPr>
@@ -2523,6 +2875,7 @@
           <w:color w:val="FF0000"/>
         </w:rPr>
       </w:pPr>
+      <w:bookmarkStart w:id="1" w:name="_Hlk211955762"/>
       <w:r>
         <w:rPr>
           <w:color w:val="FF0000"/>
@@ -2554,11 +2907,7 @@
         <w:t>0.179</w:t>
       </w:r>
     </w:p>
-    <w:p>
-      <w:r>
-        <w:br w:type="page"/>
-      </w:r>
-    </w:p>
+    <w:bookmarkEnd w:id="1"/>
     <w:p/>
     <w:p>
       <w:pPr>
@@ -2674,7 +3023,13 @@
         <w:rPr>
           <w:color w:val="FF0000"/>
         </w:rPr>
-        <w:t>= -0.333</w:t>
+        <w:t>= -0.33</w:t>
+      </w:r>
+      <w:r>
+        <w:rPr>
+          <w:color w:val="FF0000"/>
+        </w:rPr>
+        <w:t>1</w:t>
       </w:r>
     </w:p>
     <w:p>
@@ -2695,7 +3050,15 @@
         <w:t>Also,</w:t>
       </w:r>
       <w:r>
-        <w:t xml:space="preserve"> between which putt variable and success variable is the correlation the </w:t>
+        <w:t xml:space="preserve"> between </w:t>
+      </w:r>
+      <w:proofErr w:type="gramStart"/>
+      <w:r>
+        <w:t>which putt</w:t>
+      </w:r>
+      <w:proofErr w:type="gramEnd"/>
+      <w:r>
+        <w:t xml:space="preserve"> variable and success variable is the correlation the </w:t>
       </w:r>
       <w:proofErr w:type="gramStart"/>
       <w:r>
@@ -2736,6 +3099,12 @@
         <w:rPr>
           <w:color w:val="FF0000"/>
         </w:rPr>
+        <w:t>ing</w:t>
+      </w:r>
+      <w:r>
+        <w:rPr>
+          <w:color w:val="FF0000"/>
+        </w:rPr>
         <w:t xml:space="preserve"> and</w:t>
       </w:r>
       <w:r>
@@ -2766,7 +3135,13 @@
         <w:rPr>
           <w:color w:val="FF0000"/>
         </w:rPr>
-        <w:t>-0.358</w:t>
+        <w:t>-0.35</w:t>
+      </w:r>
+      <w:r>
+        <w:rPr>
+          <w:color w:val="FF0000"/>
+        </w:rPr>
+        <w:t>7</w:t>
       </w:r>
     </w:p>
     <w:p>
@@ -2790,16 +3165,42 @@
         </w:numPr>
       </w:pPr>
       <w:r>
-        <w:t xml:space="preserve">Write a brief interpretation of the correlation between the drive variable and success variable </w:t>
-      </w:r>
-      <w:r>
-        <w:t xml:space="preserve">and the correlation between the putt variable and success variable </w:t>
-      </w:r>
-      <w:r>
-        <w:t>that you found in</w:t>
-      </w:r>
-      <w:r>
-        <w:t xml:space="preserve"> #4.</w:t>
+        <w:t xml:space="preserve">Write a brief interpretation of the </w:t>
+      </w:r>
+      <w:r>
+        <w:t xml:space="preserve">direction of association </w:t>
+      </w:r>
+      <w:r>
+        <w:t xml:space="preserve">between the drive variable and success variable </w:t>
+      </w:r>
+      <w:r>
+        <w:t xml:space="preserve">you found in 4(a) </w:t>
+      </w:r>
+      <w:proofErr w:type="gramStart"/>
+      <w:r>
+        <w:t xml:space="preserve">and </w:t>
+      </w:r>
+      <w:r>
+        <w:t>also</w:t>
+      </w:r>
+      <w:proofErr w:type="gramEnd"/>
+      <w:r>
+        <w:t xml:space="preserve"> </w:t>
+      </w:r>
+      <w:r>
+        <w:t xml:space="preserve">between the putt variable and success variable </w:t>
+      </w:r>
+      <w:r>
+        <w:t>in</w:t>
+      </w:r>
+      <w:r>
+        <w:t xml:space="preserve"> </w:t>
+      </w:r>
+      <w:r>
+        <w:t>4(b)</w:t>
+      </w:r>
+      <w:r>
+        <w:t>.</w:t>
       </w:r>
     </w:p>
     <w:p>
@@ -2808,11 +3209,12 @@
           <w:color w:val="FF0000"/>
         </w:rPr>
       </w:pPr>
-      <w:r>
-        <w:rPr>
-          <w:color w:val="FF0000"/>
-        </w:rPr>
-        <w:t>There is a weak negative correlation between Strokes Gained Driv</w:t>
+      <w:bookmarkStart w:id="2" w:name="_Hlk211956505"/>
+      <w:r>
+        <w:rPr>
+          <w:color w:val="FF0000"/>
+        </w:rPr>
+        <w:t>There is a negative correlation between Strokes Gained Driv</w:t>
       </w:r>
       <w:r>
         <w:rPr>
@@ -2842,7 +3244,19 @@
         <w:rPr>
           <w:color w:val="FF0000"/>
         </w:rPr>
-        <w:t xml:space="preserve"> There is a </w:t>
+        <w:t xml:space="preserve"> There is a</w:t>
+      </w:r>
+      <w:r>
+        <w:rPr>
+          <w:color w:val="FF0000"/>
+        </w:rPr>
+        <w:t xml:space="preserve"> slightly </w:t>
+      </w:r>
+      <w:r>
+        <w:rPr>
+          <w:color w:val="FF0000"/>
+        </w:rPr>
+        <w:t xml:space="preserve"> </w:t>
       </w:r>
       <w:r>
         <w:rPr>
@@ -2866,7 +3280,7 @@
         <w:rPr>
           <w:color w:val="FF0000"/>
         </w:rPr>
-        <w:t xml:space="preserve"> and Average Score, such as Strokes Gained Putt</w:t>
+        <w:t xml:space="preserve"> and Average Score, as Strokes Gained Putt</w:t>
       </w:r>
       <w:r>
         <w:rPr>
@@ -2881,6 +3295,7 @@
         <w:t xml:space="preserve"> increases, Average Score decreases.</w:t>
       </w:r>
     </w:p>
+    <w:bookmarkEnd w:id="2"/>
     <w:p/>
     <w:p/>
     <w:p/>
@@ -2920,7 +3335,10 @@
         <w:t xml:space="preserve"> most predictable</w:t>
       </w:r>
       <w:r>
-        <w:t xml:space="preserve"> and why?</w:t>
+        <w:t xml:space="preserve"> </w:t>
+      </w:r>
+      <w:r>
+        <w:t xml:space="preserve">by driving and putting results? Explain why you made this choice. </w:t>
       </w:r>
     </w:p>
     <w:p>
@@ -2929,6 +3347,7 @@
           <w:color w:val="FF0000"/>
         </w:rPr>
       </w:pPr>
+      <w:bookmarkStart w:id="3" w:name="_Hlk211956538"/>
       <w:proofErr w:type="spellStart"/>
       <w:r>
         <w:rPr>
@@ -2959,23 +3378,34 @@
         <w:rPr>
           <w:color w:val="FF0000"/>
         </w:rPr>
-        <w:t xml:space="preserve">the best correlated values </w:t>
-      </w:r>
-      <w:r>
-        <w:rPr>
-          <w:color w:val="FF0000"/>
-        </w:rPr>
-        <w:t xml:space="preserve">for drive variables and putt </w:t>
-      </w:r>
-      <w:proofErr w:type="gramStart"/>
-      <w:r>
-        <w:rPr>
-          <w:color w:val="FF0000"/>
-        </w:rPr>
-        <w:t>variables</w:t>
-      </w:r>
-      <w:proofErr w:type="gramEnd"/>
+        <w:t xml:space="preserve">the best </w:t>
+      </w:r>
+      <w:r>
+        <w:rPr>
+          <w:color w:val="FF0000"/>
+        </w:rPr>
+        <w:t>correlation values of the “success” variables with all three drive variables</w:t>
+      </w:r>
+      <w:r>
+        <w:rPr>
+          <w:color w:val="FF0000"/>
+        </w:rPr>
+        <w:t xml:space="preserve"> </w:t>
+      </w:r>
+      <w:r>
+        <w:rPr>
+          <w:color w:val="FF0000"/>
+        </w:rPr>
+        <w:t xml:space="preserve">and </w:t>
+      </w:r>
+      <w:r>
+        <w:rPr>
+          <w:color w:val="FF0000"/>
+        </w:rPr>
+        <w:t xml:space="preserve">the best overall correlation with shots gained. putting </w:t>
+      </w:r>
     </w:p>
+    <w:bookmarkEnd w:id="3"/>
     <w:p/>
     <w:p/>
     <w:p>
@@ -3014,6 +3444,7 @@
           <w:color w:val="FF0000"/>
         </w:rPr>
       </w:pPr>
+      <w:bookmarkStart w:id="4" w:name="_Hlk211956548"/>
       <w:r>
         <w:rPr>
           <w:color w:val="FF0000"/>
@@ -3036,8 +3467,55 @@
         <w:rPr>
           <w:color w:val="FF0000"/>
         </w:rPr>
-        <w:t>the correlation between the putt variables and the success variables are much greater than the correlation between the drive variables and the success variables.</w:t>
-      </w:r>
+        <w:t xml:space="preserve">the correlation between </w:t>
+      </w:r>
+      <w:r>
+        <w:rPr>
+          <w:color w:val="FF0000"/>
+        </w:rPr>
+        <w:t xml:space="preserve">each of the success variable is highest with shots gained putting.  Also, the correlations between Money and </w:t>
+      </w:r>
+      <w:proofErr w:type="spellStart"/>
+      <w:r>
+        <w:rPr>
+          <w:color w:val="FF0000"/>
+        </w:rPr>
+        <w:t>Fede</w:t>
+      </w:r>
+      <w:r>
+        <w:rPr>
+          <w:color w:val="FF0000"/>
+        </w:rPr>
+        <w:t>x</w:t>
+      </w:r>
+      <w:proofErr w:type="spellEnd"/>
+      <w:r>
+        <w:rPr>
+          <w:color w:val="FF0000"/>
+        </w:rPr>
+        <w:t xml:space="preserve"> is higher for average putts per round and </w:t>
+      </w:r>
+      <w:r>
+        <w:rPr>
+          <w:color w:val="FF0000"/>
+        </w:rPr>
+        <w:t xml:space="preserve">one putt percentage than average diving distance or driving percentage.  The only putting correlations with success variables that are weak are scouring average with one </w:t>
+      </w:r>
+      <w:proofErr w:type="gramStart"/>
+      <w:r>
+        <w:rPr>
+          <w:color w:val="FF0000"/>
+        </w:rPr>
+        <w:t>putt</w:t>
+      </w:r>
+      <w:proofErr w:type="gramEnd"/>
+      <w:r>
+        <w:rPr>
+          <w:color w:val="FF0000"/>
+        </w:rPr>
+        <w:t xml:space="preserve"> percentage or average putts per round. </w:t>
+      </w:r>
+      <w:bookmarkEnd w:id="4"/>
     </w:p>
     <w:sectPr>
       <w:pgSz w:w="12240" w:h="15840"/>
@@ -3049,8 +3527,82 @@
 </w:document>
 </file>
 
+<file path=word/endnotes.xml><?xml version="1.0" encoding="utf-8"?>
+<w:endnotes xmlns:wpc="http://schemas.microsoft.com/office/word/2010/wordprocessingCanvas" xmlns:cx="http://schemas.microsoft.com/office/drawing/2014/chartex" xmlns:cx1="http://schemas.microsoft.com/office/drawing/2015/9/8/chartex" xmlns:cx2="http://schemas.microsoft.com/office/drawing/2015/10/21/chartex" xmlns:cx3="http://schemas.microsoft.com/office/drawing/2016/5/9/chartex" xmlns:cx4="http://schemas.microsoft.com/office/drawing/2016/5/10/chartex" xmlns:cx5="http://schemas.microsoft.com/office/drawing/2016/5/11/chartex" xmlns:cx6="http://schemas.microsoft.com/office/drawing/2016/5/12/chartex" xmlns:cx7="http://schemas.microsoft.com/office/drawing/2016/5/13/chartex" xmlns:cx8="http://schemas.microsoft.com/office/drawing/2016/5/14/chartex" xmlns:mc="http://schemas.openxmlformats.org/markup-compatibility/2006" xmlns:aink="http://schemas.microsoft.com/office/drawing/2016/ink" xmlns:am3d="http://schemas.microsoft.com/office/drawing/2017/model3d" xmlns:o="urn:schemas-microsoft-com:office:office" xmlns:oel="http://schemas.microsoft.com/office/2019/extlst" xmlns:r="http://schemas.openxmlformats.org/officeDocument/2006/relationships" xmlns:m="http://schemas.openxmlformats.org/officeDocument/2006/math" xmlns:v="urn:schemas-microsoft-com:vml" xmlns:wp14="http://schemas.microsoft.com/office/word/2010/wordprocessingDrawing" xmlns:wp="http://schemas.openxmlformats.org/drawingml/2006/wordprocessingDrawing" xmlns:w10="urn:schemas-microsoft-com:office:word" xmlns:w="http://schemas.openxmlformats.org/wordprocessingml/2006/main" xmlns:w14="http://schemas.microsoft.com/office/word/2010/wordml" xmlns:w15="http://schemas.microsoft.com/office/word/2012/wordml" xmlns:w16cex="http://schemas.microsoft.com/office/word/2018/wordml/cex" xmlns:w16cid="http://schemas.microsoft.com/office/word/2016/wordml/cid" xmlns:w16="http://schemas.microsoft.com/office/word/2018/wordml" xmlns:w16du="http://schemas.microsoft.com/office/word/2023/wordml/word16du" xmlns:w16sdtdh="http://schemas.microsoft.com/office/word/2020/wordml/sdtdatahash" xmlns:w16sdtfl="http://schemas.microsoft.com/office/word/2024/wordml/sdtformatlock" xmlns:w16se="http://schemas.microsoft.com/office/word/2015/wordml/symex" xmlns:wpg="http://schemas.microsoft.com/office/word/2010/wordprocessingGroup" xmlns:wpi="http://schemas.microsoft.com/office/word/2010/wordprocessingInk" xmlns:wne="http://schemas.microsoft.com/office/word/2006/wordml" xmlns:wps="http://schemas.microsoft.com/office/word/2010/wordprocessingShape" mc:Ignorable="w14 w15 w16se w16cid w16 w16cex w16sdtdh w16sdtfl w16du wp14">
+  <w:endnote w:type="separator" w:id="-1">
+    <w:p>
+      <w:pPr>
+        <w:spacing w:after="0" w:line="240" w:lineRule="auto"/>
+      </w:pPr>
+      <w:r>
+        <w:separator/>
+      </w:r>
+    </w:p>
+  </w:endnote>
+  <w:endnote w:type="continuationSeparator" w:id="0">
+    <w:p>
+      <w:pPr>
+        <w:spacing w:after="0" w:line="240" w:lineRule="auto"/>
+      </w:pPr>
+      <w:r>
+        <w:continuationSeparator/>
+      </w:r>
+    </w:p>
+  </w:endnote>
+</w:endnotes>
+</file>
+
+<file path=word/footnotes.xml><?xml version="1.0" encoding="utf-8"?>
+<w:footnotes xmlns:wpc="http://schemas.microsoft.com/office/word/2010/wordprocessingCanvas" xmlns:cx="http://schemas.microsoft.com/office/drawing/2014/chartex" xmlns:cx1="http://schemas.microsoft.com/office/drawing/2015/9/8/chartex" xmlns:cx2="http://schemas.microsoft.com/office/drawing/2015/10/21/chartex" xmlns:cx3="http://schemas.microsoft.com/office/drawing/2016/5/9/chartex" xmlns:cx4="http://schemas.microsoft.com/office/drawing/2016/5/10/chartex" xmlns:cx5="http://schemas.microsoft.com/office/drawing/2016/5/11/chartex" xmlns:cx6="http://schemas.microsoft.com/office/drawing/2016/5/12/chartex" xmlns:cx7="http://schemas.microsoft.com/office/drawing/2016/5/13/chartex" xmlns:cx8="http://schemas.microsoft.com/office/drawing/2016/5/14/chartex" xmlns:mc="http://schemas.openxmlformats.org/markup-compatibility/2006" xmlns:aink="http://schemas.microsoft.com/office/drawing/2016/ink" xmlns:am3d="http://schemas.microsoft.com/office/drawing/2017/model3d" xmlns:o="urn:schemas-microsoft-com:office:office" xmlns:oel="http://schemas.microsoft.com/office/2019/extlst" xmlns:r="http://schemas.openxmlformats.org/officeDocument/2006/relationships" xmlns:m="http://schemas.openxmlformats.org/officeDocument/2006/math" xmlns:v="urn:schemas-microsoft-com:vml" xmlns:wp14="http://schemas.microsoft.com/office/word/2010/wordprocessingDrawing" xmlns:wp="http://schemas.openxmlformats.org/drawingml/2006/wordprocessingDrawing" xmlns:w10="urn:schemas-microsoft-com:office:word" xmlns:w="http://schemas.openxmlformats.org/wordprocessingml/2006/main" xmlns:w14="http://schemas.microsoft.com/office/word/2010/wordml" xmlns:w15="http://schemas.microsoft.com/office/word/2012/wordml" xmlns:w16cex="http://schemas.microsoft.com/office/word/2018/wordml/cex" xmlns:w16cid="http://schemas.microsoft.com/office/word/2016/wordml/cid" xmlns:w16="http://schemas.microsoft.com/office/word/2018/wordml" xmlns:w16du="http://schemas.microsoft.com/office/word/2023/wordml/word16du" xmlns:w16sdtdh="http://schemas.microsoft.com/office/word/2020/wordml/sdtdatahash" xmlns:w16sdtfl="http://schemas.microsoft.com/office/word/2024/wordml/sdtformatlock" xmlns:w16se="http://schemas.microsoft.com/office/word/2015/wordml/symex" xmlns:wpg="http://schemas.microsoft.com/office/word/2010/wordprocessingGroup" xmlns:wpi="http://schemas.microsoft.com/office/word/2010/wordprocessingInk" xmlns:wne="http://schemas.microsoft.com/office/word/2006/wordml" xmlns:wps="http://schemas.microsoft.com/office/word/2010/wordprocessingShape" mc:Ignorable="w14 w15 w16se w16cid w16 w16cex w16sdtdh w16sdtfl w16du wp14">
+  <w:footnote w:type="separator" w:id="-1">
+    <w:p>
+      <w:pPr>
+        <w:spacing w:after="0" w:line="240" w:lineRule="auto"/>
+      </w:pPr>
+      <w:r>
+        <w:separator/>
+      </w:r>
+    </w:p>
+  </w:footnote>
+  <w:footnote w:type="continuationSeparator" w:id="0">
+    <w:p>
+      <w:pPr>
+        <w:spacing w:after="0" w:line="240" w:lineRule="auto"/>
+      </w:pPr>
+      <w:r>
+        <w:continuationSeparator/>
+      </w:r>
+    </w:p>
+  </w:footnote>
+  <w:footnote w:id="1">
+    <w:p>
+      <w:pPr>
+        <w:pStyle w:val="FootnoteText"/>
+      </w:pPr>
+      <w:r>
+        <w:rPr>
+          <w:rStyle w:val="FootnoteReference"/>
+        </w:rPr>
+        <w:footnoteRef/>
+      </w:r>
+      <w:r>
+        <w:t xml:space="preserve"> To compute strokes gained a player’s performance is compared to what an average player does. For example, pro players who are on the green 10 feet from the hole might average 1.61 putts to get the ball in the hole.  If a player makes a putt from 10 feet, they  gain 1.61-1=0.61 strokes putting.  If they miss the first putt and make the second they will “gain”  1.61-2=-0.39 strokes putting (which is </w:t>
+      </w:r>
+      <w:proofErr w:type="gramStart"/>
+      <w:r>
+        <w:t>actually a</w:t>
+      </w:r>
+      <w:proofErr w:type="gramEnd"/>
+      <w:r>
+        <w:t xml:space="preserve"> loss). . </w:t>
+      </w:r>
+    </w:p>
+  </w:footnote>
+</w:footnotes>
+</file>
+
 <file path=word/numbering.xml><?xml version="1.0" encoding="utf-8"?>
-<w:numbering xmlns:wpc="http://schemas.microsoft.com/office/word/2010/wordprocessingCanvas" xmlns:cx="http://schemas.microsoft.com/office/drawing/2014/chartex" xmlns:cx1="http://schemas.microsoft.com/office/drawing/2015/9/8/chartex" xmlns:cx2="http://schemas.microsoft.com/office/drawing/2015/10/21/chartex" xmlns:cx3="http://schemas.microsoft.com/office/drawing/2016/5/9/chartex" xmlns:cx4="http://schemas.microsoft.com/office/drawing/2016/5/10/chartex" xmlns:cx5="http://schemas.microsoft.com/office/drawing/2016/5/11/chartex" xmlns:cx6="http://schemas.microsoft.com/office/drawing/2016/5/12/chartex" xmlns:cx7="http://schemas.microsoft.com/office/drawing/2016/5/13/chartex" xmlns:cx8="http://schemas.microsoft.com/office/drawing/2016/5/14/chartex" xmlns:mc="http://schemas.openxmlformats.org/markup-compatibility/2006" xmlns:aink="http://schemas.microsoft.com/office/drawing/2016/ink" xmlns:am3d="http://schemas.microsoft.com/office/drawing/2017/model3d" xmlns:o="urn:schemas-microsoft-com:office:office" xmlns:oel="http://schemas.microsoft.com/office/2019/extlst" xmlns:r="http://schemas.openxmlformats.org/officeDocument/2006/relationships" xmlns:m="http://schemas.openxmlformats.org/officeDocument/2006/math" xmlns:v="urn:schemas-microsoft-com:vml" xmlns:wp14="http://schemas.microsoft.com/office/word/2010/wordprocessingDrawing" xmlns:wp="http://schemas.openxmlformats.org/drawingml/2006/wordprocessingDrawing" xmlns:w10="urn:schemas-microsoft-com:office:word" xmlns:w="http://schemas.openxmlformats.org/wordprocessingml/2006/main" xmlns:w14="http://schemas.microsoft.com/office/word/2010/wordml" xmlns:w15="http://schemas.microsoft.com/office/word/2012/wordml" xmlns:w16cex="http://schemas.microsoft.com/office/word/2018/wordml/cex" xmlns:w16cid="http://schemas.microsoft.com/office/word/2016/wordml/cid" xmlns:w16="http://schemas.microsoft.com/office/word/2018/wordml" xmlns:w16du="http://schemas.microsoft.com/office/word/2023/wordml/word16du" xmlns:w16sdtdh="http://schemas.microsoft.com/office/word/2020/wordml/sdtdatahash" xmlns:w16se="http://schemas.microsoft.com/office/word/2015/wordml/symex" xmlns:wpg="http://schemas.microsoft.com/office/word/2010/wordprocessingGroup" xmlns:wpi="http://schemas.microsoft.com/office/word/2010/wordprocessingInk" xmlns:wne="http://schemas.microsoft.com/office/word/2006/wordml" xmlns:wps="http://schemas.microsoft.com/office/word/2010/wordprocessingShape" mc:Ignorable="w14 w15 w16se w16cid w16 w16cex w16sdtdh wp14">
+<w:numbering xmlns:wpc="http://schemas.microsoft.com/office/word/2010/wordprocessingCanvas" xmlns:cx="http://schemas.microsoft.com/office/drawing/2014/chartex" xmlns:cx1="http://schemas.microsoft.com/office/drawing/2015/9/8/chartex" xmlns:cx2="http://schemas.microsoft.com/office/drawing/2015/10/21/chartex" xmlns:cx3="http://schemas.microsoft.com/office/drawing/2016/5/9/chartex" xmlns:cx4="http://schemas.microsoft.com/office/drawing/2016/5/10/chartex" xmlns:cx5="http://schemas.microsoft.com/office/drawing/2016/5/11/chartex" xmlns:cx6="http://schemas.microsoft.com/office/drawing/2016/5/12/chartex" xmlns:cx7="http://schemas.microsoft.com/office/drawing/2016/5/13/chartex" xmlns:cx8="http://schemas.microsoft.com/office/drawing/2016/5/14/chartex" xmlns:mc="http://schemas.openxmlformats.org/markup-compatibility/2006" xmlns:aink="http://schemas.microsoft.com/office/drawing/2016/ink" xmlns:am3d="http://schemas.microsoft.com/office/drawing/2017/model3d" xmlns:o="urn:schemas-microsoft-com:office:office" xmlns:oel="http://schemas.microsoft.com/office/2019/extlst" xmlns:r="http://schemas.openxmlformats.org/officeDocument/2006/relationships" xmlns:m="http://schemas.openxmlformats.org/officeDocument/2006/math" xmlns:v="urn:schemas-microsoft-com:vml" xmlns:wp14="http://schemas.microsoft.com/office/word/2010/wordprocessingDrawing" xmlns:wp="http://schemas.openxmlformats.org/drawingml/2006/wordprocessingDrawing" xmlns:w10="urn:schemas-microsoft-com:office:word" xmlns:w="http://schemas.openxmlformats.org/wordprocessingml/2006/main" xmlns:w14="http://schemas.microsoft.com/office/word/2010/wordml" xmlns:w15="http://schemas.microsoft.com/office/word/2012/wordml" xmlns:w16cex="http://schemas.microsoft.com/office/word/2018/wordml/cex" xmlns:w16cid="http://schemas.microsoft.com/office/word/2016/wordml/cid" xmlns:w16="http://schemas.microsoft.com/office/word/2018/wordml" xmlns:w16du="http://schemas.microsoft.com/office/word/2023/wordml/word16du" xmlns:w16sdtdh="http://schemas.microsoft.com/office/word/2020/wordml/sdtdatahash" xmlns:w16sdtfl="http://schemas.microsoft.com/office/word/2024/wordml/sdtformatlock" xmlns:w16se="http://schemas.microsoft.com/office/word/2015/wordml/symex" xmlns:wpg="http://schemas.microsoft.com/office/word/2010/wordprocessingGroup" xmlns:wpi="http://schemas.microsoft.com/office/word/2010/wordprocessingInk" xmlns:wne="http://schemas.microsoft.com/office/word/2006/wordml" xmlns:wps="http://schemas.microsoft.com/office/word/2010/wordprocessingShape" mc:Ignorable="w14 w15 w16se w16cid w16 w16cex w16sdtdh w16sdtfl w16du wp14">
   <w:abstractNum w:abstractNumId="0" w15:restartNumberingAfterBreak="0">
     <w:nsid w:val="530773AC"/>
     <w:multiLevelType w:val="hybridMultilevel"/>
@@ -3147,7 +3699,7 @@
 </file>
 
 <file path=word/styles.xml><?xml version="1.0" encoding="utf-8"?>
-<w:styles xmlns:mc="http://schemas.openxmlformats.org/markup-compatibility/2006" xmlns:r="http://schemas.openxmlformats.org/officeDocument/2006/relationships" xmlns:w="http://schemas.openxmlformats.org/wordprocessingml/2006/main" xmlns:w14="http://schemas.microsoft.com/office/word/2010/wordml" xmlns:w15="http://schemas.microsoft.com/office/word/2012/wordml" xmlns:w16cex="http://schemas.microsoft.com/office/word/2018/wordml/cex" xmlns:w16cid="http://schemas.microsoft.com/office/word/2016/wordml/cid" xmlns:w16="http://schemas.microsoft.com/office/word/2018/wordml" xmlns:w16sdtdh="http://schemas.microsoft.com/office/word/2020/wordml/sdtdatahash" xmlns:w16se="http://schemas.microsoft.com/office/word/2015/wordml/symex" mc:Ignorable="w14 w15 w16se w16cid w16 w16cex w16sdtdh">
+<w:styles xmlns:mc="http://schemas.openxmlformats.org/markup-compatibility/2006" xmlns:r="http://schemas.openxmlformats.org/officeDocument/2006/relationships" xmlns:w="http://schemas.openxmlformats.org/wordprocessingml/2006/main" xmlns:w14="http://schemas.microsoft.com/office/word/2010/wordml" xmlns:w15="http://schemas.microsoft.com/office/word/2012/wordml" xmlns:w16cex="http://schemas.microsoft.com/office/word/2018/wordml/cex" xmlns:w16cid="http://schemas.microsoft.com/office/word/2016/wordml/cid" xmlns:w16="http://schemas.microsoft.com/office/word/2018/wordml" xmlns:w16du="http://schemas.microsoft.com/office/word/2023/wordml/word16du" xmlns:w16sdtdh="http://schemas.microsoft.com/office/word/2020/wordml/sdtdatahash" xmlns:w16sdtfl="http://schemas.microsoft.com/office/word/2024/wordml/sdtformatlock" xmlns:w16se="http://schemas.microsoft.com/office/word/2015/wordml/symex" mc:Ignorable="w14 w15 w16se w16cid w16 w16cex w16sdtdh w16sdtfl w16du">
   <w:docDefaults>
     <w:rPrDefault>
       <w:rPr>
@@ -3605,6 +4157,45 @@
       </w:tblBorders>
     </w:tblPr>
   </w:style>
+  <w:style w:type="paragraph" w:styleId="FootnoteText">
+    <w:name w:val="footnote text"/>
+    <w:basedOn w:val="Normal"/>
+    <w:link w:val="FootnoteTextChar"/>
+    <w:uiPriority w:val="99"/>
+    <w:semiHidden/>
+    <w:unhideWhenUsed/>
+    <w:rsid w:val="009E7F12"/>
+    <w:pPr>
+      <w:spacing w:after="0" w:line="240" w:lineRule="auto"/>
+    </w:pPr>
+    <w:rPr>
+      <w:sz w:val="20"/>
+      <w:szCs w:val="20"/>
+    </w:rPr>
+  </w:style>
+  <w:style w:type="character" w:customStyle="1" w:styleId="FootnoteTextChar">
+    <w:name w:val="Footnote Text Char"/>
+    <w:basedOn w:val="DefaultParagraphFont"/>
+    <w:link w:val="FootnoteText"/>
+    <w:uiPriority w:val="99"/>
+    <w:semiHidden/>
+    <w:rsid w:val="009E7F12"/>
+    <w:rPr>
+      <w:sz w:val="20"/>
+      <w:szCs w:val="20"/>
+    </w:rPr>
+  </w:style>
+  <w:style w:type="character" w:styleId="FootnoteReference">
+    <w:name w:val="footnote reference"/>
+    <w:basedOn w:val="DefaultParagraphFont"/>
+    <w:uiPriority w:val="99"/>
+    <w:semiHidden/>
+    <w:unhideWhenUsed/>
+    <w:rsid w:val="009E7F12"/>
+    <w:rPr>
+      <w:vertAlign w:val="superscript"/>
+    </w:rPr>
+  </w:style>
 </w:styles>
 </file>
 
@@ -3901,4 +4492,16 @@
     </a:ext>
   </a:extLst>
 </a:theme>
+</file>
+
+<file path=customXml/item1.xml><?xml version="1.0" encoding="utf-8"?>
+<b:Sources xmlns:b="http://schemas.openxmlformats.org/officeDocument/2006/bibliography" xmlns="http://schemas.openxmlformats.org/officeDocument/2006/bibliography" SelectedStyle="\APASixthEditionOfficeOnline.xsl" StyleName="APA" Version="6"/>
+</file>
+
+<file path=customXml/itemProps1.xml><?xml version="1.0" encoding="utf-8"?>
+<ds:datastoreItem xmlns:ds="http://schemas.openxmlformats.org/officeDocument/2006/customXml" ds:itemID="{503A01B1-7177-4BEE-A44A-5A9D8CC89A1F}">
+  <ds:schemaRefs>
+    <ds:schemaRef ds:uri="http://schemas.openxmlformats.org/officeDocument/2006/bibliography"/>
+  </ds:schemaRefs>
+</ds:datastoreItem>
 </file>
</xml_diff>